<commit_message>
pandoc reference: table borders
Таблицы pandoc в docx-шаблоне по умолчанию рендерились без видимых границ
ячеек — добавлен set_table_borders() (0.5pt серые, все грани) в
build_pandoc_reference.py, регенерирован pandoc_reference.docx.

Co-Authored-By: Claude Sonnet 5 <noreply@anthropic.com>
</commit_message>
<xml_diff>
--- a/templates/pandoc_reference.docx
+++ b/templates/pandoc_reference.docx
@@ -1052,6 +1052,14 @@
     <w:qFormat/>
     <w:tblPr>
       <w:tblInd w:w="0" w:type="dxa"/>
+      <w:tblBorders>
+        <w:top w:val="single" w:sz="4" w:space="0" w:color="808080"/>
+        <w:left w:val="single" w:sz="4" w:space="0" w:color="808080"/>
+        <w:bottom w:val="single" w:sz="4" w:space="0" w:color="808080"/>
+        <w:right w:val="single" w:sz="4" w:space="0" w:color="808080"/>
+        <w:insideH w:val="single" w:sz="4" w:space="0" w:color="808080"/>
+        <w:insideV w:val="single" w:sz="4" w:space="0" w:color="808080"/>
+      </w:tblBorders>
       <w:tblCellMar>
         <w:top w:w="0" w:type="dxa"/>
         <w:left w:w="108" w:type="dxa"/>

</xml_diff>